<commit_message>
feat(palestras): fecha a aula da Copel com o QR code da pesquisa de avaliação
Acrescenta, depois do fechamento, uma tela com a imagem da pesquisa de
avaliação do encontro de 09/10, hospedada no Cloudinary e dimensionada pela
altura útil do slide. O guia do facilitador ganha a linha da tela 31, e o
index.json registra a nova tela.

Co-Authored-By: Claude Opus 5.5 <noreply@anthropic.com>
Claude-Session: https://claude.ai/code/session_01LKavBbzuCsNGTvmY2ZGBcU
</commit_message>
<xml_diff>
--- a/pages/palestras/assets/copel/facilitador/guia-do-facilitador.docx
+++ b/pages/palestras/assets/copel/facilitador/guia-do-facilitador.docx
@@ -814,6 +814,41 @@
             </w:pPr>
             <w:r>
               <w:t xml:space="preserve">Fechamento: quantos argumentos vieram do parecer e o que ficou com o conselho.</w:t>
+            </w:r>
+          </w:p>
+        </w:tc>
+      </w:tr>
+      <w:tr>
+        <w:tc>
+          <w:tcPr/>
+          <w:p>
+            <w:pPr>
+              <w:pStyle w:val="Compact"/>
+            </w:pPr>
+            <w:r>
+              <w:t xml:space="preserve">11:00</w:t>
+            </w:r>
+          </w:p>
+        </w:tc>
+        <w:tc>
+          <w:tcPr/>
+          <w:p>
+            <w:pPr>
+              <w:pStyle w:val="Compact"/>
+            </w:pPr>
+            <w:r>
+              <w:t xml:space="preserve">31</w:t>
+            </w:r>
+          </w:p>
+        </w:tc>
+        <w:tc>
+          <w:tcPr/>
+          <w:p>
+            <w:pPr>
+              <w:pStyle w:val="Compact"/>
+            </w:pPr>
+            <w:r>
+              <w:t xml:space="preserve">Pesquisa de avaliação: deixar o QR code projetado enquanto os participantes respondem.</w:t>
             </w:r>
           </w:p>
         </w:tc>

</xml_diff>

<commit_message>
feat(palestras): entrega os papéis da reunião do conselho da Copel por QR code
O slide 26 deixa de remeter aos cartões impressos e passa a trazer um QR
code para a nova página pages/palestras/ferramentas/copel-papeis-do-conselho.html.
Cada participante escaneia o código, toca no número atribuído pelo
professor e vê no celular o cartão do seu papel: perspectiva, posição a
favor ou contra, seções da proposta por onde começar, pergunta típica,
preparação e tempo de fala, além do link da proposta B. As posições
seguem a tabela do guia e podem ser trocadas pelo parâmetro #posicoes no
endereço; o papel escolhido fica salvo no navegador.

O material, o leia-me e o guia do facilitador passam a descrever a página;
os cartões impressos ficam como plano B. O index.json ganha a nova página.

Co-Authored-By: Claude Opus 5.5 <noreply@anthropic.com>
Claude-Session: https://claude.ai/code/session_01LKavBbzuCsNGTvmY2ZGBcU
</commit_message>
<xml_diff>
--- a/pages/palestras/assets/copel/facilitador/guia-do-facilitador.docx
+++ b/pages/palestras/assets/copel/facilitador/guia-do-facilitador.docx
@@ -171,7 +171,55 @@
         </w:numPr>
       </w:pPr>
       <w:r>
-        <w:t xml:space="preserve">[ ] Dez cartões de papel impressos (</w:t>
+        <w:t xml:space="preserve">[ ] Página dos papéis (</w:t>
+      </w:r>
+      <w:r>
+        <w:rPr>
+          <w:rStyle w:val="VerbatimChar"/>
+        </w:rPr>
+        <w:t xml:space="preserve">pages/palestras/ferramentas/copel-papeis-do-conselho.html</w:t>
+      </w:r>
+      <w:r>
+        <w:t xml:space="preserve">) aberta em um celular pelo QR code do slide 26. As posições seguem a tabela da seção 4; para mudá-las sem editar a página, acrescente ao endereço</w:t>
+      </w:r>
+      <w:r>
+        <w:t xml:space="preserve"> </w:t>
+      </w:r>
+      <w:r>
+        <w:rPr>
+          <w:rStyle w:val="VerbatimChar"/>
+        </w:rPr>
+        <w:t xml:space="preserve">#posicoes=</w:t>
+      </w:r>
+      <w:r>
+        <w:t xml:space="preserve"> </w:t>
+      </w:r>
+      <w:r>
+        <w:t xml:space="preserve">e oito letras F ou C, na ordem dos conselheiros 1 a 8 (por exemplo,</w:t>
+      </w:r>
+      <w:r>
+        <w:t xml:space="preserve"> </w:t>
+      </w:r>
+      <w:r>
+        <w:rPr>
+          <w:rStyle w:val="VerbatimChar"/>
+        </w:rPr>
+        <w:t xml:space="preserve">#posicoes=CCFCFCFF</w:t>
+      </w:r>
+      <w:r>
+        <w:t xml:space="preserve">), e projete esse endereço.</w:t>
+      </w:r>
+    </w:p>
+    <w:p>
+      <w:pPr>
+        <w:pStyle w:val="Compact"/>
+        <w:numPr>
+          <w:ilvl w:val="0"/>
+          <w:numId w:val="1001"/>
+        </w:numPr>
+      </w:pPr>
+      <w:r>
+        <w:t xml:space="preserve">[ ] Dez números escritos em papel (diretor, presidente e conselheiros 1 a 8), para entregar na volta do intervalo. Cartões impressos (</w:t>
       </w:r>
       <w:r>
         <w:rPr>
@@ -180,7 +228,7 @@
         <w:t xml:space="preserve">conselho/cartoes-de-papel.docx</w:t>
       </w:r>
       <w:r>
-        <w:t xml:space="preserve">), com a posição de cada conselheiro anotada (seção 4).</w:t>
+        <w:t xml:space="preserve">) só como plano B.</w:t>
       </w:r>
     </w:p>
     <w:p>
@@ -533,7 +581,7 @@
               <w:pStyle w:val="Compact"/>
             </w:pPr>
             <w:r>
-              <w:t xml:space="preserve">Intervalo de 15 min. Distribuir os cartões de papel na volta, virados para baixo.</w:t>
+              <w:t xml:space="preserve">Intervalo de 15 min. Entregar os números dos papéis na volta, virados para baixo.</w:t>
             </w:r>
           </w:p>
         </w:tc>
@@ -673,7 +721,7 @@
               <w:pStyle w:val="Compact"/>
             </w:pPr>
             <w:r>
-              <w:t xml:space="preserve">Abertura da simulação. Entregar a proposta B e pedir que virem os cartões.</w:t>
+              <w:t xml:space="preserve">Abertura da simulação. Pedir que escaneiem o QR code e toquem no número recebido.</w:t>
             </w:r>
           </w:p>
         </w:tc>
@@ -1531,7 +1579,7 @@
         </w:numPr>
       </w:pPr>
       <w:r>
-        <w:t xml:space="preserve">Sem rede: arquivos no pendrive.</w:t>
+        <w:t xml:space="preserve">Sem rede: arquivos no pendrive e cartões de papel impressos no lugar da página dos papéis.</w:t>
       </w:r>
     </w:p>
     <w:bookmarkEnd w:id="16"/>

</xml_diff>

<commit_message>
docs(palestras): descreve o sorteio automático dos papéis do conselho da Copel
Com as funções do Supabase criadas e testadas, o slide 26, o material, o
guia do facilitador e o index.json passam a dizer que cada celular recebe
um papel sorteado sem repetição. O guia registra o painel do professor e o
reinício do sorteio antes do slide 26; o token fica fora do repositório.

Co-Authored-By: Claude Opus 5.5 <noreply@anthropic.com>
Claude-Session: https://claude.ai/code/session_01LKavBbzuCsNGTvmY2ZGBcU
</commit_message>
<xml_diff>
--- a/pages/palestras/assets/copel/facilitador/guia-do-facilitador.docx
+++ b/pages/palestras/assets/copel/facilitador/guia-do-facilitador.docx
@@ -180,7 +180,16 @@
         <w:t xml:space="preserve">pages/palestras/ferramentas/copel-papeis-do-conselho.html</w:t>
       </w:r>
       <w:r>
-        <w:t xml:space="preserve">) aberta em um celular pelo QR code do slide 26. As posições seguem a tabela da seção 4; para mudá-las sem editar a página, acrescente ao endereço</w:t>
+        <w:t xml:space="preserve">) aberta em um celular pelo QR code do slide 26. Cada celular recebe um dos dez papéis, sorteado sem repetição pelo Supabase (</w:t>
+      </w:r>
+      <w:r>
+        <w:rPr>
+          <w:rStyle w:val="VerbatimChar"/>
+        </w:rPr>
+        <w:t xml:space="preserve">supabase/conselho-papeis.sql</w:t>
+      </w:r>
+      <w:r>
+        <w:t xml:space="preserve">); quem recarrega vê o mesmo papel, e a partir do 11º celular a página oferece a escolha manual por número. As posições seguem a tabela da seção 4; para mudá-las, acrescente ao endereço do QR code</w:t>
       </w:r>
       <w:r>
         <w:t xml:space="preserve"> </w:t>
@@ -195,19 +204,7 @@
         <w:t xml:space="preserve"> </w:t>
       </w:r>
       <w:r>
-        <w:t xml:space="preserve">e oito letras F ou C, na ordem dos conselheiros 1 a 8 (por exemplo,</w:t>
-      </w:r>
-      <w:r>
-        <w:t xml:space="preserve"> </w:t>
-      </w:r>
-      <w:r>
-        <w:rPr>
-          <w:rStyle w:val="VerbatimChar"/>
-        </w:rPr>
-        <w:t xml:space="preserve">#posicoes=CCFCFCFF</w:t>
-      </w:r>
-      <w:r>
-        <w:t xml:space="preserve">), e projete esse endereço.</w:t>
+        <w:t xml:space="preserve">e oito letras F ou C, na ordem dos conselheiros 1 a 8.</w:t>
       </w:r>
     </w:p>
     <w:p>
@@ -219,7 +216,34 @@
         </w:numPr>
       </w:pPr>
       <w:r>
-        <w:t xml:space="preserve">[ ] Dez números escritos em papel (diretor, presidente e conselheiros 1 a 8), para entregar na volta do intervalo. Cartões impressos (</w:t>
+        <w:t xml:space="preserve">[ ] Painel do professor: o mesmo endereço com</w:t>
+      </w:r>
+      <w:r>
+        <w:t xml:space="preserve"> </w:t>
+      </w:r>
+      <w:r>
+        <w:rPr>
+          <w:rStyle w:val="VerbatimChar"/>
+        </w:rPr>
+        <w:t xml:space="preserve">#host=</w:t>
+      </w:r>
+      <w:r>
+        <w:t xml:space="preserve"> </w:t>
+      </w:r>
+      <w:r>
+        <w:t xml:space="preserve">seguido do token do professor (combinado fora do repositório). Mostra quantos papéis já foram sorteados e tem o botão Reiniciar o sorteio. Reiniciar depois dos testes e de novo às 9:55, antes de projetar o slide 26.</w:t>
+      </w:r>
+    </w:p>
+    <w:p>
+      <w:pPr>
+        <w:pStyle w:val="Compact"/>
+        <w:numPr>
+          <w:ilvl w:val="0"/>
+          <w:numId w:val="1001"/>
+        </w:numPr>
+      </w:pPr>
+      <w:r>
+        <w:t xml:space="preserve">[ ] Cartões impressos (</w:t>
       </w:r>
       <w:r>
         <w:rPr>
@@ -228,7 +252,7 @@
         <w:t xml:space="preserve">conselho/cartoes-de-papel.docx</w:t>
       </w:r>
       <w:r>
-        <w:t xml:space="preserve">) só como plano B.</w:t>
+        <w:t xml:space="preserve">) só como plano B, para o caso de faltar internet.</w:t>
       </w:r>
     </w:p>
     <w:p>
@@ -581,7 +605,7 @@
               <w:pStyle w:val="Compact"/>
             </w:pPr>
             <w:r>
-              <w:t xml:space="preserve">Intervalo de 15 min. Entregar os números dos papéis na volta, virados para baixo.</w:t>
+              <w:t xml:space="preserve">Intervalo de 15 min. Reiniciar o sorteio pelo painel do professor.</w:t>
             </w:r>
           </w:p>
         </w:tc>
@@ -721,7 +745,7 @@
               <w:pStyle w:val="Compact"/>
             </w:pPr>
             <w:r>
-              <w:t xml:space="preserve">Abertura da simulação. Pedir que escaneiem o QR code e toquem no número recebido.</w:t>
+              <w:t xml:space="preserve">Abertura da simulação. Pedir que escaneiem o QR code; cada celular recebe um papel sorteado.</w:t>
             </w:r>
           </w:p>
         </w:tc>

</xml_diff>